<commit_message>
feat(packaging): fase 9 — bundle backend sidecar + Electron Builder installer
- Add PyInstaller spec and main_cli.py entrypoint for backend sidecar
- Add build scripts: build-backend.js, copy-ffmpeg.js, verify-build.js
- Configure electron-builder.yml for macOS .dmg and Windows .exe
- Update main.js to spawn PyInstaller sidecar in production
- Bundle ffmpeg/ffprobe static binaries via extraResources
- Add CI package job for macOS/Windows installers + artifact upload
- Add build manifest verification tests
- Update README build/packaging instructions
</commit_message>
<xml_diff>
--- a/docs/Arsitektur_Teknis_AutoClip_Lokal.docx
+++ b/docs/Arsitektur_Teknis_AutoClip_Lokal.docx
@@ -3256,6 +3256,30 @@
       </w:pPr>
       <w:r>
         <w:t xml:space="preserve">Kapasitas render bergantung pada spesifikasi device user (CPU/GPU); tidak ada batas keras jumlah job paralel selain yang diatur di Job Queue.</w:t>
+      </w:r>
+    </w:p>
+    <w:p>
+      <w:r>
+        <w:rPr>
+          <w:b/>
+        </w:rPr>
+        <w:t>Update Arsitektur Packaging</w:t>
+      </w:r>
+    </w:p>
+    <w:p>
+      <w:r>
+        <w:rPr>
+          <w:b w:val="0"/>
+        </w:rPr>
+        <w:t>Backend Python di-bundle dengan PyInstaller dari entrypoint backend/main_cli.py menjadi executable autoclip-backend. Electron Builder menyalin executable beserta ffmpeg/ffprobe ke resources/backend/ melalui konfigurasi extraResources.</w:t>
+      </w:r>
+    </w:p>
+    <w:p>
+      <w:r>
+        <w:rPr>
+          <w:b w:val="0"/>
+        </w:rPr>
+        <w:t>Saat runtime, Electron main process (src/main/main.js) mendeteksi app.isPackaged. Pada mode production sidecar dijalankan dari process.resourcesPath/backend/autoclip-backend dengan PATH yang mencakup resources/backend/bin sehingga ffmpeg/ffprobe ditemukan. Mode development tetap spawn python dari venv.</w:t>
       </w:r>
     </w:p>
     <w:sectPr>

</xml_diff>

<commit_message>
docs: update README dan dokumen Word untuk rilis v0.1.0
- Tambah section QA & Rilis di README beserta known issues
- Dokumentasikan perintah smoke test pipeline nyata
- Update versi PRD & Arsitektur ke 0.1.0
- Tandai Fase 10 selesai di Task List TDD
</commit_message>
<xml_diff>
--- a/docs/Arsitektur_Teknis_AutoClip_Lokal.docx
+++ b/docs/Arsitektur_Teknis_AutoClip_Lokal.docx
@@ -81,11 +81,7 @@
         <w:jc w:val="center"/>
       </w:pPr>
       <w:r>
-        <w:rPr>
-          <w:sz w:val="20"/>
-          <w:szCs w:val="20"/>
-        </w:rPr>
-        <w:t xml:space="preserve">Versi: 0.1 — Referensi: PRD &amp; Task List TDD AutoClip Lokal</w:t>
+        <w:t>Versi: 0.1.0 — Rilis MVP — Referensi: PRD &amp; Task List TDD AutoClip Lokal</w:t>
       </w:r>
     </w:p>
     <w:p>

</xml_diff>